<commit_message>
Add ML prediction API roles route simulator and update documents
</commit_message>
<xml_diff>
--- a/deliverables/APL_Logistics_Executive_Summary.docx
+++ b/deliverables/APL_Logistics_Executive_Summary.docx
@@ -25,7 +25,7 @@
     </w:p>
     <w:p>
       <w:r>
-        <w:t>The delivery-performance dashboard shows that delay exposure is material and concentrated in specific shipping modes. The immediate priority is to review service promises and operating conditions for First Class and Second Class shipments. The dashboard is ready for managers to filter by market, region, country, and customer segment and to download the underlying filtered records for follow-up.</w:t>
+        <w:t>The delivery-performance dashboard shows that delay exposure is material and concentrated in specific shipping modes. The immediate priority is to review service promises and operating conditions for First Class and Second Class shipments. The upgraded dashboard also provides historical delay-risk estimates, local live-data API support, controlled user roles, and a route-planning simulator for operational exploration.</w:t>
       </w:r>
     </w:p>
     <w:p>
@@ -625,7 +625,39 @@
     </w:p>
     <w:p>
       <w:r>
-        <w:t>The Streamlit dashboard is ready for local use. It provides KPI cards, delay distributions, shipping-mode comparison, regional and geographic risk views, a priority matrix, filter controls, and a filtered-data download. It is designed for diagnosis and prioritization, not for predicting future delivery delays.</w:t>
+        <w:t>The Streamlit dashboard is ready for local use. It provides KPI cards, delay distributions, shipping-mode comparison, regional and geographic risk views, a priority matrix, filter controls, a filtered-data download, and a machine-learning delay-risk estimate. The model achieved 69.8 percent validation accuracy and 0.740 ROC-AUC on historical held-out data. It supports prioritization, not automatic decisions or a guarantee of future delivery outcomes.</w:t>
+      </w:r>
+    </w:p>
+    <w:p>
+      <w:pPr>
+        <w:pStyle w:val="ListBullet"/>
+      </w:pPr>
+      <w:r>
+        <w:t>Viewer users can review the dashboard overview and operational metrics.</w:t>
+      </w:r>
+    </w:p>
+    <w:p>
+      <w:pPr>
+        <w:pStyle w:val="ListBullet"/>
+      </w:pPr>
+      <w:r>
+        <w:t>Analyst users can export filtered data and use delay prediction and route-planning tools.</w:t>
+      </w:r>
+    </w:p>
+    <w:p>
+      <w:pPr>
+        <w:pStyle w:val="ListBullet"/>
+      </w:pPr>
+      <w:r>
+        <w:t>Admin users can refresh the local SQLite database that supports the FastAPI health, summary, and shipment endpoints.</w:t>
+      </w:r>
+    </w:p>
+    <w:p>
+      <w:pPr>
+        <w:pStyle w:val="ListBullet"/>
+      </w:pPr>
+      <w:r>
+        <w:t>The route-planning feature is a customer-coordinate simulator, not a real road, traffic, or carrier-cost optimizer.</w:t>
       </w:r>
     </w:p>
     <w:p>
@@ -638,7 +670,7 @@
     </w:p>
     <w:p>
       <w:r>
-        <w:t>The supplied data has no order or delivery date field, so the dashboard intentionally does not provide date-range filtering or time-trend analysis. A future phase can add those capabilities when time-stamped operational data becomes available.</w:t>
+        <w:t>The supplied data has no order or delivery date field, so the dashboard intentionally does not provide date-range filtering or time-trend analysis. The SQLite database, FastAPI service, and role login are local prototype components. A public deployment requires managed authentication, HTTPS, secret storage, backups, rate limits, and a hosted database.</w:t>
       </w:r>
     </w:p>
     <w:sectPr>

</xml_diff>